<commit_message>
Update c3 - physical layer - Network
</commit_message>
<xml_diff>
--- a/CT112/TracNghiem/thai.docx
+++ b/CT112/TracNghiem/thai.docx
@@ -35455,13 +35455,6 @@
       <w:pPr>
         <w:spacing w:before="160" w:after="60" w:line="240" w:lineRule="auto"/>
         <w:rPr>
-          <w:rFonts w:ascii="Times New Roman" w:eastAsia="Times New Roman" w:hAnsi="Times New Roman" w:cs="Times New Roman"/>
-          <w:sz w:val="24"/>
-          <w:szCs w:val="24"/>
-        </w:rPr>
-      </w:pPr>
-      <w:r>
-        <w:rPr>
           <w:rFonts w:ascii="Arial" w:eastAsia="Times New Roman" w:hAnsi="Arial" w:cs="Arial"/>
           <w:b/>
           <w:bCs/>
@@ -35470,8 +35463,7 @@
           <w:szCs w:val="20"/>
           <w:shd w:val="clear" w:color="auto" w:fill="FFFFFF"/>
         </w:rPr>
-        <w:t xml:space="preserve">d. </w:t>
-      </w:r>
+      </w:pPr>
       <w:r>
         <w:rPr>
           <w:rFonts w:ascii="Arial" w:eastAsia="Times New Roman" w:hAnsi="Arial" w:cs="Arial"/>
@@ -35482,7 +35474,122 @@
           <w:szCs w:val="20"/>
           <w:shd w:val="clear" w:color="auto" w:fill="FFFFFF"/>
         </w:rPr>
+        <w:t xml:space="preserve">d. </w:t>
+      </w:r>
+      <w:r>
+        <w:rPr>
+          <w:rFonts w:ascii="Arial" w:eastAsia="Times New Roman" w:hAnsi="Arial" w:cs="Arial"/>
+          <w:b/>
+          <w:bCs/>
+          <w:color w:val="555555"/>
+          <w:sz w:val="20"/>
+          <w:szCs w:val="20"/>
+          <w:shd w:val="clear" w:color="auto" w:fill="FFFFFF"/>
+        </w:rPr>
         <w:t>16</w:t>
+      </w:r>
+    </w:p>
+    <w:p>
+      <w:pPr>
+        <w:spacing w:before="160" w:after="60" w:line="240" w:lineRule="auto"/>
+        <w:rPr>
+          <w:rFonts w:ascii="Times New Roman" w:eastAsia="Times New Roman" w:hAnsi="Times New Roman" w:cs="Times New Roman"/>
+          <w:sz w:val="24"/>
+          <w:szCs w:val="24"/>
+        </w:rPr>
+      </w:pPr>
+      <w:r>
+        <w:rPr>
+          <w:rFonts w:ascii="Times New Roman" w:eastAsia="Times New Roman" w:hAnsi="Times New Roman" w:cs="Times New Roman"/>
+          <w:sz w:val="24"/>
+          <w:szCs w:val="24"/>
+        </w:rPr>
+        <w:lastRenderedPageBreak/>
+        <w:t xml:space="preserve">12. Chọn mệnh đề diễn tả đúng lợi ích của mạng máy tính? </w:t>
+      </w:r>
+    </w:p>
+    <w:p>
+      <w:pPr>
+        <w:spacing w:before="160" w:after="60" w:line="240" w:lineRule="auto"/>
+        <w:rPr>
+          <w:rFonts w:ascii="Times New Roman" w:eastAsia="Times New Roman" w:hAnsi="Times New Roman" w:cs="Times New Roman"/>
+          <w:sz w:val="24"/>
+          <w:szCs w:val="24"/>
+        </w:rPr>
+      </w:pPr>
+      <w:r>
+        <w:rPr>
+          <w:rFonts w:ascii="Times New Roman" w:eastAsia="Times New Roman" w:hAnsi="Times New Roman" w:cs="Times New Roman"/>
+          <w:b/>
+          <w:bCs/>
+          <w:sz w:val="24"/>
+          <w:szCs w:val="24"/>
+        </w:rPr>
+        <w:t>Tăng cường tính bảo mật thông tin:</w:t>
+      </w:r>
+      <w:r>
+        <w:rPr>
+          <w:rFonts w:ascii="Times New Roman" w:eastAsia="Times New Roman" w:hAnsi="Times New Roman" w:cs="Times New Roman"/>
+          <w:sz w:val="24"/>
+          <w:szCs w:val="24"/>
+        </w:rPr>
+        <w:t xml:space="preserve"> do chương trình và dữ liệu được đặt trên các máy chủ và thiết bị lưu trữ chuyên dụng với nhiều cơ chế đặc biệt đảm bảo độ ổn định </w:t>
+      </w:r>
+    </w:p>
+    <w:p>
+      <w:pPr>
+        <w:spacing w:before="160" w:after="60" w:line="240" w:lineRule="auto"/>
+        <w:rPr>
+          <w:rFonts w:ascii="Times New Roman" w:eastAsia="Times New Roman" w:hAnsi="Times New Roman" w:cs="Times New Roman"/>
+          <w:sz w:val="24"/>
+          <w:szCs w:val="24"/>
+        </w:rPr>
+      </w:pPr>
+      <w:r>
+        <w:rPr>
+          <w:rFonts w:ascii="Times New Roman" w:eastAsia="Times New Roman" w:hAnsi="Times New Roman" w:cs="Times New Roman"/>
+          <w:b/>
+          <w:bCs/>
+          <w:sz w:val="24"/>
+          <w:szCs w:val="24"/>
+        </w:rPr>
+        <w:t>Năng cao độ tin cậy của hệ thống:</w:t>
+      </w:r>
+      <w:r>
+        <w:rPr>
+          <w:rFonts w:ascii="Times New Roman" w:eastAsia="Times New Roman" w:hAnsi="Times New Roman" w:cs="Times New Roman"/>
+          <w:sz w:val="24"/>
+          <w:szCs w:val="24"/>
+        </w:rPr>
+        <w:t xml:space="preserve"> khi sử dụng mạng có thể thực hiện một chương trình tại nhiều máy tính khác nhau, nhiều thiết bị có thể dùng chung. Điều này tăng độ tin cậy trong công việc khi có hỏng hóc xảy ra. </w:t>
+      </w:r>
+    </w:p>
+    <w:p>
+      <w:pPr>
+        <w:spacing w:before="160" w:after="60" w:line="240" w:lineRule="auto"/>
+        <w:rPr>
+          <w:rFonts w:ascii="Times New Roman" w:eastAsia="Times New Roman" w:hAnsi="Times New Roman" w:cs="Times New Roman"/>
+          <w:sz w:val="24"/>
+          <w:szCs w:val="24"/>
+        </w:rPr>
+      </w:pPr>
+      <w:r>
+        <w:rPr>
+          <w:rFonts w:ascii="Times New Roman" w:eastAsia="Times New Roman" w:hAnsi="Times New Roman" w:cs="Times New Roman"/>
+          <w:b/>
+          <w:bCs/>
+          <w:sz w:val="24"/>
+          <w:szCs w:val="24"/>
+        </w:rPr>
+        <w:t>Giảm chi phí đầu ra:</w:t>
+      </w:r>
+      <w:r>
+        <w:rPr>
+          <w:rFonts w:ascii="Times New Roman" w:eastAsia="Times New Roman" w:hAnsi="Times New Roman" w:cs="Times New Roman"/>
+          <w:sz w:val="24"/>
+          <w:szCs w:val="24"/>
+        </w:rPr>
+        <w:t xml:space="preserve"> do các thiết bị phần cứng, phần mềm đắt tiền được chia sẻ và dùng chung.</w:t>
       </w:r>
     </w:p>
     <w:sectPr>

</xml_diff>